<commit_message>
Fix repudiation narrative: ACKO's 25.06.2025 email pre-dated biopsy
The 'Update on Your Claim' email of 25.06.2025 quoted the
genitourinary entry and asserted 'not related to a malignancy'
five days before the histopathology report existed. Corrected the
earlier claim that the sub-clause was first disclosed before the
Ombudsman, and turned the premature medical conclusion into a
ground across complaint, explainer, manual and reckoner.

Co-Authored-By: Claude Fable 5 <noreply@anthropic.com>
Claude-Session: https://claude.ai/code/session_01PvWKpJ311CVHomte8xk3CL
</commit_message>
<xml_diff>
--- a/CASE/Complaint_Saral_Hindi_Vyakhya.docx
+++ b/CASE/Complaint_Saral_Hindi_Vyakhya.docx
@@ -763,7 +763,7 @@
                 <w:i w:val="0"/>
                 <w:sz w:val="20"/>
               </w:rPr>
-              <w:t>शिकायत अधिकारी (GRO) ने मना किया</w:t>
+              <w:t>कंपनी ने "Update on Your Claim" ईमेल में लिख दिया — "यह ऑपरेशन malignancy से जुड़ा नहीं है"</w:t>
             </w:r>
           </w:p>
         </w:tc>
@@ -773,6 +773,15 @@
           </w:tcPr>
           <w:p>
             <w:r/>
+            <w:r>
+              <w:rPr>
+                <w:rFonts w:ascii="Nirmala UI" w:hAnsi="Nirmala UI" w:cs="Nirmala UI" w:eastAsia="Nirmala UI"/>
+                <w:b/>
+                <w:i w:val="0"/>
+                <w:sz w:val="20"/>
+              </w:rPr>
+              <w:t>बायोप्सी रिपोर्ट से 5 दिन पहले ही मेडिकल फैसला सुना दिया!</w:t>
+            </w:r>
           </w:p>
         </w:tc>
       </w:tr>
@@ -1901,7 +1910,7 @@
           <w:i w:val="0"/>
           <w:sz w:val="22"/>
         </w:rPr>
-        <w:t>1. किस सूचीबद्ध बीमारी के तहत ठुकराया, बताया? नहीं।</w:t>
+        <w:t>1. 25.06.2025 को "यह ऑपरेशन malignancy से जुड़ा नहीं" लिखने का कोई मेडिकल आधार था? नहीं — बायोप्सी रिपोर्ट तो 5 दिन बाद (30.06) आई।</w:t>
       </w:r>
     </w:p>
     <w:p>

</xml_diff>